<commit_message>
Inbound template: barcode codes
Co-Authored-By: Claude Opus 5.5 <noreply@anthropic.com>
Claude-Session: https://claude.ai/code/session_01Xghmwqw8BQZUfvCJjFZEf9
</commit_message>
<xml_diff>
--- a/apps-script-inbound/templates/ISI_Inbound_Report_Template.docx
+++ b/apps-script-inbound/templates/ISI_Inbound_Report_Template.docx
@@ -1142,6 +1142,11 @@
             <w:t>{{id}}  ·  {{date}}  ·  {{status}}</w:t>
           </w:r>
         </w:p>
+        <w:p>
+          <w:r>
+            <w:t>{{barcode}}</w:t>
+          </w:r>
+        </w:p>
       </w:tc>
       <w:tc>
         <w:tcPr>

</xml_diff>

<commit_message>
Inbound: demo comments 30 Oct
Co-Authored-By: Claude Opus 5.5 <noreply@anthropic.com>
Claude-Session: https://claude.ai/code/session_01Xghmwqw8BQZUfvCJjFZEf9
</commit_message>
<xml_diff>
--- a/apps-script-inbound/templates/ISI_Inbound_Report_Template.docx
+++ b/apps-script-inbound/templates/ISI_Inbound_Report_Template.docx
@@ -275,6 +275,66 @@
                 <w:b w:val="0"/>
               </w:rPr>
               <w:t>{{owner}}</w:t>
+            </w:r>
+          </w:p>
+        </w:tc>
+      </w:tr>
+      <w:tr>
+        <w:tc>
+          <w:tcPr>
+            <w:tcW w:type="dxa" w:w="1701"/>
+            <w:shd w:val="clear" w:color="auto" w:fill="F2F5F9"/>
+          </w:tcPr>
+          <w:p>
+            <w:r/>
+            <w:r>
+              <w:rPr>
+                <w:b/>
+              </w:rPr>
+              <w:t>ឃ្លាំង · Warehouse</w:t>
+            </w:r>
+          </w:p>
+        </w:tc>
+        <w:tc>
+          <w:tcPr>
+            <w:tcW w:type="dxa" w:w="3458"/>
+          </w:tcPr>
+          <w:p>
+            <w:r/>
+            <w:r>
+              <w:rPr>
+                <w:b w:val="0"/>
+              </w:rPr>
+              <w:t>{{warehouse}}</w:t>
+            </w:r>
+          </w:p>
+        </w:tc>
+        <w:tc>
+          <w:tcPr>
+            <w:tcW w:type="dxa" w:w="1701"/>
+            <w:shd w:val="clear" w:color="auto" w:fill="F2F5F9"/>
+          </w:tcPr>
+          <w:p>
+            <w:r/>
+            <w:r>
+              <w:rPr>
+                <w:b/>
+              </w:rPr>
+              <w:t>សំឡេង · Voice note</w:t>
+            </w:r>
+          </w:p>
+        </w:tc>
+        <w:tc>
+          <w:tcPr>
+            <w:tcW w:type="dxa" w:w="3458"/>
+          </w:tcPr>
+          <w:p>
+            <w:r/>
+            <w:r>
+              <w:rPr>
+                <w:b w:val="0"/>
+              </w:rPr>
+              <w:t>{{voice}}</w:t>
             </w:r>
           </w:p>
         </w:tc>
@@ -716,7 +776,7 @@
           <w:color w:val="011E41"/>
           <w:sz w:val="19"/>
         </w:rPr>
-        <w:t>C. ពេលវេលា និងកម្មករ · TIME AND MANPOWER</w:t>
+        <w:t>C. ពេលវេលា និងបុគ្គលិកឃ្លាំង · TIME AND MANPOWER</w:t>
       </w:r>
     </w:p>
     <w:tbl>
@@ -841,7 +901,7 @@
               <w:rPr>
                 <w:b/>
               </w:rPr>
-              <w:t>កម្មករ · Manpower</w:t>
+              <w:t>បុគ្គលិកឃ្លាំង · Manpower</w:t>
             </w:r>
           </w:p>
         </w:tc>

</xml_diff>